<commit_message>
Deploy latest version of PFS documents d5d9f5e93f0c8e3eb01679e24d2da6c74187931f
</commit_message>
<xml_diff>
--- a/latest/NLSR.docx
+++ b/latest/NLSR.docx
@@ -3307,7 +3307,7 @@
     </w:p>
     <w:bookmarkEnd w:id="99"/>
     <w:bookmarkEnd w:id="100"/>
-    <w:bookmarkStart w:id="104" w:name="sec:meta-odqual-sr"/>
+    <w:bookmarkStart w:id="104" w:name="sec:meta-odqual"/>
     <w:p>
       <w:pPr>
         <w:pStyle w:val="berschrift4"/>
@@ -3339,7 +3339,7 @@
         <w:rPr>
           <w:rStyle w:val="VerbatimChar"/>
         </w:rPr>
-        <w:t xml:space="preserve">meta-odqual-sr</w:t>
+        <w:t xml:space="preserve">meta-odqual</w:t>
       </w:r>
     </w:p>
     <w:bookmarkStart w:id="101" w:name="threshold-requirements-16"/>
@@ -7961,7 +7961,7 @@
               <w:rPr>
                 <w:rStyle w:val="VerbatimChar"/>
               </w:rPr>
-              <w:t xml:space="preserve">meta-odqual-sr</w:t>
+              <w:t xml:space="preserve">meta-odqual</w:t>
             </w:r>
           </w:p>
         </w:tc>

</xml_diff>

<commit_message>
Deploy latest version of PFS documents ee8d9c5e466da39020bda837627898e12e9fcec7
</commit_message>
<xml_diff>
--- a/latest/NLSR.docx
+++ b/latest/NLSR.docx
@@ -144,7 +144,7 @@
       </w:hyperlink>
     </w:p>
     <w:bookmarkEnd w:id="29"/>
-    <w:bookmarkStart w:id="31" w:name="document-history"/>
+    <w:bookmarkStart w:id="32" w:name="document-history"/>
     <w:p>
       <w:pPr>
         <w:pStyle w:val="berschrift2"/>
@@ -159,7 +159,7 @@
         <w:pStyle w:val="berschrift3"/>
       </w:pPr>
       <w:r>
-        <w:t xml:space="preserve">2026-03-26 (PATCH)</w:t>
+        <w:t xml:space="preserve">2026-08-31 (PATCH)</w:t>
       </w:r>
     </w:p>
     <w:p>
@@ -171,91 +171,19 @@
         </w:numPr>
       </w:pPr>
       <w:r>
-        <w:t xml:space="preserve">Renamed CARD4L to CEOS-ARD</w:t>
-      </w:r>
-    </w:p>
-    <w:p>
-      <w:pPr>
-        <w:pStyle w:val="Compact"/>
-        <w:numPr>
-          <w:ilvl w:val="0"/>
-          <w:numId w:val="1001"/>
-        </w:numPr>
-      </w:pPr>
-      <w:r>
-        <w:t xml:space="preserve">Restructured the document; removed empty or unused parts</w:t>
-      </w:r>
-    </w:p>
-    <w:p>
-      <w:pPr>
-        <w:pStyle w:val="Compact"/>
-        <w:numPr>
-          <w:ilvl w:val="0"/>
-          <w:numId w:val="1001"/>
-        </w:numPr>
-      </w:pPr>
-      <w:r>
-        <w:t xml:space="preserve">Document history has been reset. Check the previous versions for details</w:t>
-      </w:r>
-    </w:p>
-    <w:p>
-      <w:pPr>
-        <w:pStyle w:val="Compact"/>
-        <w:numPr>
-          <w:ilvl w:val="0"/>
-          <w:numId w:val="1001"/>
-        </w:numPr>
-      </w:pPr>
-      <w:r>
-        <w:t xml:space="preserve">Numerical identifiers were rotated and are deprecated; new textual identifiers have been added</w:t>
-      </w:r>
-    </w:p>
-    <w:p>
-      <w:pPr>
-        <w:pStyle w:val="Compact"/>
-        <w:numPr>
-          <w:ilvl w:val="0"/>
-          <w:numId w:val="1001"/>
-        </w:numPr>
-      </w:pPr>
-      <w:r>
-        <w:t xml:space="preserve">The requirement</w:t>
-      </w:r>
-      <w:r>
-        <w:t xml:space="preserve"> </w:t>
-      </w:r>
-      <w:r>
-        <w:t xml:space="preserve">“Radiometric corrections must lead to a valid measurement […]”</w:t>
-      </w:r>
-      <w:r>
-        <w:t xml:space="preserve"> </w:t>
-      </w:r>
-      <w:r>
-        <w:t xml:space="preserve">has been moved from the category description to the measurement requirement.</w:t>
-      </w:r>
-    </w:p>
-    <w:p>
-      <w:pPr>
-        <w:pStyle w:val="Compact"/>
-        <w:numPr>
-          <w:ilvl w:val="0"/>
-          <w:numId w:val="1001"/>
-        </w:numPr>
-      </w:pPr>
-      <w:r>
-        <w:t xml:space="preserve">If no threshold requirement applies, the wording has been made consistent (e.g. former req. 1.7 and 1.8).</w:t>
-      </w:r>
-    </w:p>
-    <w:p>
-      <w:pPr>
-        <w:pStyle w:val="Compact"/>
-        <w:numPr>
-          <w:ilvl w:val="0"/>
-          <w:numId w:val="1001"/>
-        </w:numPr>
-      </w:pPr>
-      <w:r>
-        <w:t xml:space="preserve">Former req. 2.13 has been removed as it had neither a threshold nor a goal requirement.</w:t>
+        <w:t xml:space="preserve">Updated</w:t>
+      </w:r>
+      <w:r>
+        <w:t xml:space="preserve"> </w:t>
+      </w:r>
+      <w:r>
+        <w:t xml:space="preserve">‘Applies to’</w:t>
+      </w:r>
+      <w:r>
+        <w:t xml:space="preserve"> </w:t>
+      </w:r>
+      <w:r>
+        <w:t xml:space="preserve">statement</w:t>
       </w:r>
     </w:p>
     <w:p>
@@ -273,7 +201,7 @@
         <w:t xml:space="preserve"> </w:t>
       </w:r>
       <w:r>
-        <w:t xml:space="preserve">Migration to building blocks.</w:t>
+        <w:t xml:space="preserve">Minor editorial update</w:t>
       </w:r>
     </w:p>
     <w:p>
@@ -291,12 +219,154 @@
         <w:t xml:space="preserve"> </w:t>
       </w:r>
       <w:r>
+        <w:t xml:space="preserve">Harvey Jones</w:t>
+      </w:r>
+    </w:p>
+    <w:bookmarkEnd w:id="30"/>
+    <w:bookmarkStart w:id="31" w:name="patch-1"/>
+    <w:p>
+      <w:pPr>
+        <w:pStyle w:val="berschrift3"/>
+      </w:pPr>
+      <w:r>
+        <w:t xml:space="preserve">2026-03-26 (PATCH)</w:t>
+      </w:r>
+    </w:p>
+    <w:p>
+      <w:pPr>
+        <w:pStyle w:val="Compact"/>
+        <w:numPr>
+          <w:ilvl w:val="0"/>
+          <w:numId w:val="1002"/>
+        </w:numPr>
+      </w:pPr>
+      <w:r>
+        <w:t xml:space="preserve">Renamed CARD4L to CEOS-ARD</w:t>
+      </w:r>
+    </w:p>
+    <w:p>
+      <w:pPr>
+        <w:pStyle w:val="Compact"/>
+        <w:numPr>
+          <w:ilvl w:val="0"/>
+          <w:numId w:val="1002"/>
+        </w:numPr>
+      </w:pPr>
+      <w:r>
+        <w:t xml:space="preserve">Restructured the document; removed empty or unused parts</w:t>
+      </w:r>
+    </w:p>
+    <w:p>
+      <w:pPr>
+        <w:pStyle w:val="Compact"/>
+        <w:numPr>
+          <w:ilvl w:val="0"/>
+          <w:numId w:val="1002"/>
+        </w:numPr>
+      </w:pPr>
+      <w:r>
+        <w:t xml:space="preserve">Document history has been reset. Check the previous versions for details</w:t>
+      </w:r>
+    </w:p>
+    <w:p>
+      <w:pPr>
+        <w:pStyle w:val="Compact"/>
+        <w:numPr>
+          <w:ilvl w:val="0"/>
+          <w:numId w:val="1002"/>
+        </w:numPr>
+      </w:pPr>
+      <w:r>
+        <w:t xml:space="preserve">Numerical identifiers were rotated and are deprecated; new textual identifiers have been added</w:t>
+      </w:r>
+    </w:p>
+    <w:p>
+      <w:pPr>
+        <w:pStyle w:val="Compact"/>
+        <w:numPr>
+          <w:ilvl w:val="0"/>
+          <w:numId w:val="1002"/>
+        </w:numPr>
+      </w:pPr>
+      <w:r>
+        <w:t xml:space="preserve">The requirement</w:t>
+      </w:r>
+      <w:r>
+        <w:t xml:space="preserve"> </w:t>
+      </w:r>
+      <w:r>
+        <w:t xml:space="preserve">“Radiometric corrections must lead to a valid measurement […]”</w:t>
+      </w:r>
+      <w:r>
+        <w:t xml:space="preserve"> </w:t>
+      </w:r>
+      <w:r>
+        <w:t xml:space="preserve">has been moved from the category description to the measurement requirement.</w:t>
+      </w:r>
+    </w:p>
+    <w:p>
+      <w:pPr>
+        <w:pStyle w:val="Compact"/>
+        <w:numPr>
+          <w:ilvl w:val="0"/>
+          <w:numId w:val="1002"/>
+        </w:numPr>
+      </w:pPr>
+      <w:r>
+        <w:t xml:space="preserve">If no threshold requirement applies, the wording has been made consistent (e.g. former req. 1.7 and 1.8).</w:t>
+      </w:r>
+    </w:p>
+    <w:p>
+      <w:pPr>
+        <w:pStyle w:val="Compact"/>
+        <w:numPr>
+          <w:ilvl w:val="0"/>
+          <w:numId w:val="1002"/>
+        </w:numPr>
+      </w:pPr>
+      <w:r>
+        <w:t xml:space="preserve">Former req. 2.13 has been removed as it had neither a threshold nor a goal requirement.</w:t>
+      </w:r>
+    </w:p>
+    <w:p>
+      <w:pPr>
+        <w:pStyle w:val="FirstParagraph"/>
+      </w:pPr>
+      <w:r>
+        <w:rPr>
+          <w:b/>
+          <w:bCs/>
+        </w:rPr>
+        <w:t xml:space="preserve">Justification:</w:t>
+      </w:r>
+      <w:r>
+        <w:t xml:space="preserve"> </w:t>
+      </w:r>
+      <w:r>
+        <w:t xml:space="preserve">Migration to building blocks.</w:t>
+      </w:r>
+    </w:p>
+    <w:p>
+      <w:pPr>
+        <w:pStyle w:val="Textkrper"/>
+      </w:pPr>
+      <w:r>
+        <w:rPr>
+          <w:b/>
+          <w:bCs/>
+        </w:rPr>
+        <w:t xml:space="preserve">Editor:</w:t>
+      </w:r>
+      <w:r>
+        <w:t xml:space="preserve"> </w:t>
+      </w:r>
+      <w:r>
         <w:t xml:space="preserve">Matthias Mohr</w:t>
       </w:r>
     </w:p>
-    <w:bookmarkEnd w:id="30"/>
     <w:bookmarkEnd w:id="31"/>
-    <w:bookmarkStart w:id="32" w:name="contributing-authors"/>
+    <w:bookmarkEnd w:id="32"/>
+    <w:bookmarkStart w:id="33" w:name="contributing-authors"/>
     <w:p>
       <w:pPr>
         <w:pStyle w:val="berschrift2"/>
@@ -310,7 +380,7 @@
         <w:pStyle w:val="Compact"/>
         <w:numPr>
           <w:ilvl w:val="0"/>
-          <w:numId w:val="1002"/>
+          <w:numId w:val="1003"/>
         </w:numPr>
       </w:pPr>
       <w:r>
@@ -322,7 +392,7 @@
         <w:pStyle w:val="Compact"/>
         <w:numPr>
           <w:ilvl w:val="0"/>
-          <w:numId w:val="1002"/>
+          <w:numId w:val="1003"/>
         </w:numPr>
       </w:pPr>
       <w:r>
@@ -334,7 +404,7 @@
         <w:pStyle w:val="Compact"/>
         <w:numPr>
           <w:ilvl w:val="0"/>
-          <w:numId w:val="1002"/>
+          <w:numId w:val="1003"/>
         </w:numPr>
       </w:pPr>
       <w:r>
@@ -346,7 +416,7 @@
         <w:pStyle w:val="Compact"/>
         <w:numPr>
           <w:ilvl w:val="0"/>
-          <w:numId w:val="1002"/>
+          <w:numId w:val="1003"/>
         </w:numPr>
       </w:pPr>
       <w:r>
@@ -358,8 +428,8 @@
         <w:br w:type="page"/>
       </w:r>
     </w:p>
-    <w:bookmarkEnd w:id="32"/>
-    <w:bookmarkStart w:id="33" w:name="ceos-analysis-ready-data-definition"/>
+    <w:bookmarkEnd w:id="33"/>
+    <w:bookmarkStart w:id="34" w:name="ceos-analysis-ready-data-definition"/>
     <w:p>
       <w:pPr>
         <w:pStyle w:val="berschrift2"/>
@@ -376,8 +446,8 @@
         <w:t xml:space="preserve">CEOS Analysis Ready Data (CEOS-ARD) are satellite data that have been processed to a minimum set of requirements and organized into a form that allows immediate analysis with a minimum of additional user effort and interoperability both through time and with other datasets.</w:t>
       </w:r>
     </w:p>
-    <w:bookmarkEnd w:id="33"/>
-    <w:bookmarkStart w:id="34" w:name="description"/>
+    <w:bookmarkEnd w:id="34"/>
+    <w:bookmarkStart w:id="35" w:name="description"/>
     <w:p>
       <w:pPr>
         <w:pStyle w:val="berschrift2"/>
@@ -437,37 +507,7 @@
         <w:t xml:space="preserve"> </w:t>
       </w:r>
       <w:r>
-        <w:t xml:space="preserve">Data collected by Synthetic Aperture Radar sensors</w:t>
-      </w:r>
-    </w:p>
-    <w:bookmarkEnd w:id="34"/>
-    <w:bookmarkStart w:id="35" w:name="background"/>
-    <w:p>
-      <w:pPr>
-        <w:pStyle w:val="berschrift2"/>
-      </w:pPr>
-      <w:r>
-        <w:t xml:space="preserve">Background</w:t>
-      </w:r>
-    </w:p>
-    <w:p>
-      <w:pPr>
-        <w:pStyle w:val="FirstParagraph"/>
-      </w:pPr>
-      <w:r>
-        <w:t xml:space="preserve">Data collected with nighttime light sensors operating in the VIS/NIR wavelengths.</w:t>
-      </w:r>
-      <w:r>
-        <w:t xml:space="preserve"> </w:t>
-      </w:r>
-      <w:r>
-        <w:t xml:space="preserve">These typically operate with ground sample distance and resolution in the order of 10-1000m;</w:t>
-      </w:r>
-      <w:r>
-        <w:t xml:space="preserve"> </w:t>
-      </w:r>
-      <w:r>
-        <w:t xml:space="preserve">however, the Specification is not inherently limited to this resolution.</w:t>
+        <w:t xml:space="preserve">Data collected with nighttime light sensors operating in the VIS/NIR wavelengths. These typically operate with ground sample distance and resolution in the order of 10-1000m; however, the Specification is not inherently limited to this resolution.</w:t>
       </w:r>
     </w:p>
     <w:p>
@@ -926,7 +966,7 @@
         <w:pStyle w:val="Compact"/>
         <w:numPr>
           <w:ilvl w:val="0"/>
-          <w:numId w:val="1003"/>
+          <w:numId w:val="1004"/>
         </w:numPr>
       </w:pPr>
       <w:r>
@@ -952,7 +992,7 @@
         <w:pStyle w:val="Compact"/>
         <w:numPr>
           <w:ilvl w:val="0"/>
-          <w:numId w:val="1003"/>
+          <w:numId w:val="1004"/>
         </w:numPr>
       </w:pPr>
       <w:r>
@@ -974,7 +1014,7 @@
         <w:pStyle w:val="Compact"/>
         <w:numPr>
           <w:ilvl w:val="0"/>
-          <w:numId w:val="1004"/>
+          <w:numId w:val="1005"/>
         </w:numPr>
       </w:pPr>
       <w:r>
@@ -986,7 +1026,7 @@
         <w:pStyle w:val="Compact"/>
         <w:numPr>
           <w:ilvl w:val="0"/>
-          <w:numId w:val="1004"/>
+          <w:numId w:val="1005"/>
         </w:numPr>
       </w:pPr>
       <w:r>
@@ -998,7 +1038,7 @@
         <w:pStyle w:val="Compact"/>
         <w:numPr>
           <w:ilvl w:val="0"/>
-          <w:numId w:val="1004"/>
+          <w:numId w:val="1005"/>
         </w:numPr>
       </w:pPr>
       <w:r>
@@ -1010,7 +1050,7 @@
         <w:pStyle w:val="Compact"/>
         <w:numPr>
           <w:ilvl w:val="0"/>
-          <w:numId w:val="1004"/>
+          <w:numId w:val="1005"/>
         </w:numPr>
       </w:pPr>
       <w:r>
@@ -1111,7 +1151,7 @@
         <w:pStyle w:val="Compact"/>
         <w:numPr>
           <w:ilvl w:val="0"/>
-          <w:numId w:val="1005"/>
+          <w:numId w:val="1006"/>
         </w:numPr>
       </w:pPr>
       <w:r>
@@ -1123,7 +1163,7 @@
         <w:pStyle w:val="Compact"/>
         <w:numPr>
           <w:ilvl w:val="0"/>
-          <w:numId w:val="1005"/>
+          <w:numId w:val="1006"/>
         </w:numPr>
       </w:pPr>
       <w:r>
@@ -1135,7 +1175,7 @@
         <w:pStyle w:val="Compact"/>
         <w:numPr>
           <w:ilvl w:val="0"/>
-          <w:numId w:val="1005"/>
+          <w:numId w:val="1006"/>
         </w:numPr>
       </w:pPr>
       <w:r>
@@ -1147,7 +1187,7 @@
         <w:pStyle w:val="Compact"/>
         <w:numPr>
           <w:ilvl w:val="0"/>
-          <w:numId w:val="1005"/>
+          <w:numId w:val="1006"/>
         </w:numPr>
       </w:pPr>
       <w:r>
@@ -1248,7 +1288,7 @@
         <w:pStyle w:val="Compact"/>
         <w:numPr>
           <w:ilvl w:val="0"/>
-          <w:numId w:val="1006"/>
+          <w:numId w:val="1007"/>
         </w:numPr>
       </w:pPr>
       <w:r>
@@ -1260,7 +1300,7 @@
         <w:pStyle w:val="Compact"/>
         <w:numPr>
           <w:ilvl w:val="0"/>
-          <w:numId w:val="1006"/>
+          <w:numId w:val="1007"/>
         </w:numPr>
       </w:pPr>
       <w:r>
@@ -1272,7 +1312,7 @@
         <w:pStyle w:val="Compact"/>
         <w:numPr>
           <w:ilvl w:val="0"/>
-          <w:numId w:val="1006"/>
+          <w:numId w:val="1007"/>
         </w:numPr>
       </w:pPr>
       <w:r>
@@ -1284,7 +1324,7 @@
         <w:pStyle w:val="Compact"/>
         <w:numPr>
           <w:ilvl w:val="0"/>
-          <w:numId w:val="1006"/>
+          <w:numId w:val="1007"/>
         </w:numPr>
       </w:pPr>
       <w:r>
@@ -1385,7 +1425,7 @@
         <w:pStyle w:val="Compact"/>
         <w:numPr>
           <w:ilvl w:val="0"/>
-          <w:numId w:val="1007"/>
+          <w:numId w:val="1008"/>
         </w:numPr>
       </w:pPr>
       <w:r>
@@ -1397,7 +1437,7 @@
         <w:pStyle w:val="Compact"/>
         <w:numPr>
           <w:ilvl w:val="0"/>
-          <w:numId w:val="1007"/>
+          <w:numId w:val="1008"/>
         </w:numPr>
       </w:pPr>
       <w:r>
@@ -1409,7 +1449,7 @@
         <w:pStyle w:val="Compact"/>
         <w:numPr>
           <w:ilvl w:val="0"/>
-          <w:numId w:val="1007"/>
+          <w:numId w:val="1008"/>
         </w:numPr>
       </w:pPr>
       <w:r>
@@ -1421,7 +1461,7 @@
         <w:pStyle w:val="Compact"/>
         <w:numPr>
           <w:ilvl w:val="0"/>
-          <w:numId w:val="1007"/>
+          <w:numId w:val="1008"/>
         </w:numPr>
       </w:pPr>
       <w:r>
@@ -1525,7 +1565,7 @@
         <w:pStyle w:val="Compact"/>
         <w:numPr>
           <w:ilvl w:val="0"/>
-          <w:numId w:val="1008"/>
+          <w:numId w:val="1009"/>
         </w:numPr>
       </w:pPr>
       <w:r>
@@ -1537,7 +1577,7 @@
         <w:pStyle w:val="Compact"/>
         <w:numPr>
           <w:ilvl w:val="0"/>
-          <w:numId w:val="1008"/>
+          <w:numId w:val="1009"/>
         </w:numPr>
       </w:pPr>
       <w:r>
@@ -1549,7 +1589,7 @@
         <w:pStyle w:val="Compact"/>
         <w:numPr>
           <w:ilvl w:val="0"/>
-          <w:numId w:val="1008"/>
+          <w:numId w:val="1009"/>
         </w:numPr>
       </w:pPr>
       <w:r>
@@ -1561,7 +1601,7 @@
         <w:pStyle w:val="Compact"/>
         <w:numPr>
           <w:ilvl w:val="0"/>
-          <w:numId w:val="1008"/>
+          <w:numId w:val="1009"/>
         </w:numPr>
       </w:pPr>
       <w:r>
@@ -1665,7 +1705,7 @@
         <w:pStyle w:val="Compact"/>
         <w:numPr>
           <w:ilvl w:val="0"/>
-          <w:numId w:val="1009"/>
+          <w:numId w:val="1010"/>
         </w:numPr>
       </w:pPr>
       <w:r>
@@ -1677,7 +1717,7 @@
         <w:pStyle w:val="Compact"/>
         <w:numPr>
           <w:ilvl w:val="0"/>
-          <w:numId w:val="1009"/>
+          <w:numId w:val="1010"/>
         </w:numPr>
       </w:pPr>
       <w:r>
@@ -1689,7 +1729,7 @@
         <w:pStyle w:val="Compact"/>
         <w:numPr>
           <w:ilvl w:val="0"/>
-          <w:numId w:val="1009"/>
+          <w:numId w:val="1010"/>
         </w:numPr>
       </w:pPr>
       <w:r>
@@ -1701,7 +1741,7 @@
         <w:pStyle w:val="Compact"/>
         <w:numPr>
           <w:ilvl w:val="0"/>
-          <w:numId w:val="1009"/>
+          <w:numId w:val="1010"/>
         </w:numPr>
       </w:pPr>
       <w:r>
@@ -1805,7 +1845,7 @@
         <w:pStyle w:val="Compact"/>
         <w:numPr>
           <w:ilvl w:val="0"/>
-          <w:numId w:val="1010"/>
+          <w:numId w:val="1011"/>
         </w:numPr>
       </w:pPr>
       <w:r>
@@ -1817,7 +1857,7 @@
         <w:pStyle w:val="Compact"/>
         <w:numPr>
           <w:ilvl w:val="0"/>
-          <w:numId w:val="1010"/>
+          <w:numId w:val="1011"/>
         </w:numPr>
       </w:pPr>
       <w:r>
@@ -1829,7 +1869,7 @@
         <w:pStyle w:val="Compact"/>
         <w:numPr>
           <w:ilvl w:val="0"/>
-          <w:numId w:val="1010"/>
+          <w:numId w:val="1011"/>
         </w:numPr>
       </w:pPr>
       <w:r>
@@ -1841,7 +1881,7 @@
         <w:pStyle w:val="Compact"/>
         <w:numPr>
           <w:ilvl w:val="0"/>
-          <w:numId w:val="1010"/>
+          <w:numId w:val="1011"/>
         </w:numPr>
       </w:pPr>
       <w:r>
@@ -1955,7 +1995,7 @@
         <w:pStyle w:val="Compact"/>
         <w:numPr>
           <w:ilvl w:val="0"/>
-          <w:numId w:val="1011"/>
+          <w:numId w:val="1012"/>
         </w:numPr>
       </w:pPr>
       <w:r>
@@ -1977,7 +2017,7 @@
         <w:pStyle w:val="Compact"/>
         <w:numPr>
           <w:ilvl w:val="0"/>
-          <w:numId w:val="1012"/>
+          <w:numId w:val="1013"/>
         </w:numPr>
       </w:pPr>
       <w:r>
@@ -1989,7 +2029,7 @@
         <w:pStyle w:val="Compact"/>
         <w:numPr>
           <w:ilvl w:val="0"/>
-          <w:numId w:val="1012"/>
+          <w:numId w:val="1013"/>
         </w:numPr>
       </w:pPr>
       <w:r>
@@ -2001,7 +2041,7 @@
         <w:pStyle w:val="Compact"/>
         <w:numPr>
           <w:ilvl w:val="0"/>
-          <w:numId w:val="1012"/>
+          <w:numId w:val="1013"/>
         </w:numPr>
       </w:pPr>
       <w:r>
@@ -2013,7 +2053,7 @@
         <w:pStyle w:val="Compact"/>
         <w:numPr>
           <w:ilvl w:val="0"/>
-          <w:numId w:val="1012"/>
+          <w:numId w:val="1013"/>
         </w:numPr>
       </w:pPr>
       <w:r>
@@ -2114,7 +2154,7 @@
         <w:pStyle w:val="Compact"/>
         <w:numPr>
           <w:ilvl w:val="0"/>
-          <w:numId w:val="1013"/>
+          <w:numId w:val="1014"/>
         </w:numPr>
       </w:pPr>
       <w:r>
@@ -2126,7 +2166,7 @@
         <w:pStyle w:val="Compact"/>
         <w:numPr>
           <w:ilvl w:val="0"/>
-          <w:numId w:val="1013"/>
+          <w:numId w:val="1014"/>
         </w:numPr>
       </w:pPr>
       <w:r>
@@ -2138,7 +2178,7 @@
         <w:pStyle w:val="Compact"/>
         <w:numPr>
           <w:ilvl w:val="0"/>
-          <w:numId w:val="1013"/>
+          <w:numId w:val="1014"/>
         </w:numPr>
       </w:pPr>
       <w:r>
@@ -2150,7 +2190,7 @@
         <w:pStyle w:val="Compact"/>
         <w:numPr>
           <w:ilvl w:val="0"/>
-          <w:numId w:val="1013"/>
+          <w:numId w:val="1014"/>
         </w:numPr>
       </w:pPr>
       <w:r>
@@ -2255,7 +2295,7 @@
         <w:pStyle w:val="Compact"/>
         <w:numPr>
           <w:ilvl w:val="0"/>
-          <w:numId w:val="1014"/>
+          <w:numId w:val="1015"/>
         </w:numPr>
       </w:pPr>
       <w:r>
@@ -2277,7 +2317,7 @@
         <w:pStyle w:val="Compact"/>
         <w:numPr>
           <w:ilvl w:val="0"/>
-          <w:numId w:val="1015"/>
+          <w:numId w:val="1016"/>
         </w:numPr>
       </w:pPr>
       <w:r>
@@ -2289,7 +2329,7 @@
         <w:pStyle w:val="Compact"/>
         <w:numPr>
           <w:ilvl w:val="0"/>
-          <w:numId w:val="1015"/>
+          <w:numId w:val="1016"/>
         </w:numPr>
       </w:pPr>
       <w:r>
@@ -2301,7 +2341,7 @@
         <w:pStyle w:val="Compact"/>
         <w:numPr>
           <w:ilvl w:val="0"/>
-          <w:numId w:val="1015"/>
+          <w:numId w:val="1016"/>
         </w:numPr>
       </w:pPr>
       <w:r>
@@ -2313,7 +2353,7 @@
         <w:pStyle w:val="Compact"/>
         <w:numPr>
           <w:ilvl w:val="0"/>
-          <w:numId w:val="1015"/>
+          <w:numId w:val="1016"/>
         </w:numPr>
       </w:pPr>
       <w:r>
@@ -2421,7 +2461,7 @@
         <w:pStyle w:val="Compact"/>
         <w:numPr>
           <w:ilvl w:val="0"/>
-          <w:numId w:val="1016"/>
+          <w:numId w:val="1017"/>
         </w:numPr>
       </w:pPr>
       <w:r>
@@ -2443,7 +2483,7 @@
         <w:pStyle w:val="Compact"/>
         <w:numPr>
           <w:ilvl w:val="0"/>
-          <w:numId w:val="1017"/>
+          <w:numId w:val="1018"/>
         </w:numPr>
       </w:pPr>
       <w:r>
@@ -2455,7 +2495,7 @@
         <w:pStyle w:val="Compact"/>
         <w:numPr>
           <w:ilvl w:val="0"/>
-          <w:numId w:val="1017"/>
+          <w:numId w:val="1018"/>
         </w:numPr>
       </w:pPr>
       <w:r>
@@ -2467,7 +2507,7 @@
         <w:pStyle w:val="Compact"/>
         <w:numPr>
           <w:ilvl w:val="0"/>
-          <w:numId w:val="1017"/>
+          <w:numId w:val="1018"/>
         </w:numPr>
       </w:pPr>
       <w:r>
@@ -2479,7 +2519,7 @@
         <w:pStyle w:val="Compact"/>
         <w:numPr>
           <w:ilvl w:val="0"/>
-          <w:numId w:val="1017"/>
+          <w:numId w:val="1018"/>
         </w:numPr>
       </w:pPr>
       <w:r>
@@ -2581,7 +2621,7 @@
         <w:pStyle w:val="Compact"/>
         <w:numPr>
           <w:ilvl w:val="0"/>
-          <w:numId w:val="1018"/>
+          <w:numId w:val="1019"/>
         </w:numPr>
       </w:pPr>
       <w:r>
@@ -2603,7 +2643,7 @@
         <w:pStyle w:val="Compact"/>
         <w:numPr>
           <w:ilvl w:val="0"/>
-          <w:numId w:val="1019"/>
+          <w:numId w:val="1020"/>
         </w:numPr>
       </w:pPr>
       <w:r>
@@ -2615,7 +2655,7 @@
         <w:pStyle w:val="Compact"/>
         <w:numPr>
           <w:ilvl w:val="0"/>
-          <w:numId w:val="1019"/>
+          <w:numId w:val="1020"/>
         </w:numPr>
       </w:pPr>
       <w:r>
@@ -2627,7 +2667,7 @@
         <w:pStyle w:val="Compact"/>
         <w:numPr>
           <w:ilvl w:val="0"/>
-          <w:numId w:val="1019"/>
+          <w:numId w:val="1020"/>
         </w:numPr>
       </w:pPr>
       <w:r>
@@ -2639,7 +2679,7 @@
         <w:pStyle w:val="Compact"/>
         <w:numPr>
           <w:ilvl w:val="0"/>
-          <w:numId w:val="1019"/>
+          <w:numId w:val="1020"/>
         </w:numPr>
       </w:pPr>
       <w:r>
@@ -2726,7 +2766,7 @@
         <w:pStyle w:val="Compact"/>
         <w:numPr>
           <w:ilvl w:val="0"/>
-          <w:numId w:val="1020"/>
+          <w:numId w:val="1021"/>
         </w:numPr>
       </w:pPr>
       <w:r>
@@ -2764,7 +2804,7 @@
         <w:pStyle w:val="Compact"/>
         <w:numPr>
           <w:ilvl w:val="0"/>
-          <w:numId w:val="1021"/>
+          <w:numId w:val="1022"/>
         </w:numPr>
       </w:pPr>
       <w:r>
@@ -2776,7 +2816,7 @@
         <w:pStyle w:val="Compact"/>
         <w:numPr>
           <w:ilvl w:val="0"/>
-          <w:numId w:val="1021"/>
+          <w:numId w:val="1022"/>
         </w:numPr>
       </w:pPr>
       <w:r>
@@ -2798,7 +2838,7 @@
         <w:pStyle w:val="Compact"/>
         <w:numPr>
           <w:ilvl w:val="0"/>
-          <w:numId w:val="1022"/>
+          <w:numId w:val="1023"/>
         </w:numPr>
       </w:pPr>
       <w:r>
@@ -2810,7 +2850,7 @@
         <w:pStyle w:val="Compact"/>
         <w:numPr>
           <w:ilvl w:val="0"/>
-          <w:numId w:val="1022"/>
+          <w:numId w:val="1023"/>
         </w:numPr>
       </w:pPr>
       <w:r>
@@ -2822,7 +2862,7 @@
         <w:pStyle w:val="Compact"/>
         <w:numPr>
           <w:ilvl w:val="0"/>
-          <w:numId w:val="1022"/>
+          <w:numId w:val="1023"/>
         </w:numPr>
       </w:pPr>
       <w:r>
@@ -2834,7 +2874,7 @@
         <w:pStyle w:val="Compact"/>
         <w:numPr>
           <w:ilvl w:val="0"/>
-          <w:numId w:val="1022"/>
+          <w:numId w:val="1023"/>
         </w:numPr>
       </w:pPr>
       <w:r>
@@ -2915,7 +2955,7 @@
         <w:pStyle w:val="Compact"/>
         <w:numPr>
           <w:ilvl w:val="0"/>
-          <w:numId w:val="1023"/>
+          <w:numId w:val="1024"/>
         </w:numPr>
       </w:pPr>
       <w:r>
@@ -2955,7 +2995,7 @@
         <w:pStyle w:val="Compact"/>
         <w:numPr>
           <w:ilvl w:val="0"/>
-          <w:numId w:val="1024"/>
+          <w:numId w:val="1025"/>
         </w:numPr>
       </w:pPr>
       <w:r>
@@ -2967,7 +3007,7 @@
         <w:pStyle w:val="Compact"/>
         <w:numPr>
           <w:ilvl w:val="0"/>
-          <w:numId w:val="1024"/>
+          <w:numId w:val="1025"/>
         </w:numPr>
       </w:pPr>
       <w:r>
@@ -2979,7 +3019,7 @@
         <w:pStyle w:val="Compact"/>
         <w:numPr>
           <w:ilvl w:val="0"/>
-          <w:numId w:val="1024"/>
+          <w:numId w:val="1025"/>
         </w:numPr>
       </w:pPr>
       <w:r>
@@ -2991,7 +3031,7 @@
         <w:pStyle w:val="Compact"/>
         <w:numPr>
           <w:ilvl w:val="0"/>
-          <w:numId w:val="1024"/>
+          <w:numId w:val="1025"/>
         </w:numPr>
       </w:pPr>
       <w:r>
@@ -3095,7 +3135,7 @@
         <w:pStyle w:val="Compact"/>
         <w:numPr>
           <w:ilvl w:val="0"/>
-          <w:numId w:val="1025"/>
+          <w:numId w:val="1026"/>
         </w:numPr>
       </w:pPr>
       <w:r>
@@ -3107,7 +3147,7 @@
         <w:pStyle w:val="Compact"/>
         <w:numPr>
           <w:ilvl w:val="0"/>
-          <w:numId w:val="1025"/>
+          <w:numId w:val="1026"/>
         </w:numPr>
       </w:pPr>
       <w:r>
@@ -3119,7 +3159,7 @@
         <w:pStyle w:val="Compact"/>
         <w:numPr>
           <w:ilvl w:val="0"/>
-          <w:numId w:val="1025"/>
+          <w:numId w:val="1026"/>
         </w:numPr>
       </w:pPr>
       <w:r>
@@ -3131,7 +3171,7 @@
         <w:pStyle w:val="Compact"/>
         <w:numPr>
           <w:ilvl w:val="0"/>
-          <w:numId w:val="1025"/>
+          <w:numId w:val="1026"/>
         </w:numPr>
       </w:pPr>
       <w:r>
@@ -3212,7 +3252,7 @@
         <w:pStyle w:val="Compact"/>
         <w:numPr>
           <w:ilvl w:val="0"/>
-          <w:numId w:val="1026"/>
+          <w:numId w:val="1027"/>
         </w:numPr>
       </w:pPr>
       <w:r>
@@ -3255,7 +3295,7 @@
         <w:pStyle w:val="Compact"/>
         <w:numPr>
           <w:ilvl w:val="0"/>
-          <w:numId w:val="1027"/>
+          <w:numId w:val="1028"/>
         </w:numPr>
       </w:pPr>
       <w:r>
@@ -3267,7 +3307,7 @@
         <w:pStyle w:val="Compact"/>
         <w:numPr>
           <w:ilvl w:val="0"/>
-          <w:numId w:val="1027"/>
+          <w:numId w:val="1028"/>
         </w:numPr>
       </w:pPr>
       <w:r>
@@ -3279,7 +3319,7 @@
         <w:pStyle w:val="Compact"/>
         <w:numPr>
           <w:ilvl w:val="0"/>
-          <w:numId w:val="1027"/>
+          <w:numId w:val="1028"/>
         </w:numPr>
       </w:pPr>
       <w:r>
@@ -3291,7 +3331,7 @@
         <w:pStyle w:val="Compact"/>
         <w:numPr>
           <w:ilvl w:val="0"/>
-          <w:numId w:val="1027"/>
+          <w:numId w:val="1028"/>
         </w:numPr>
       </w:pPr>
       <w:r>
@@ -3385,7 +3425,7 @@
         <w:pStyle w:val="Compact"/>
         <w:numPr>
           <w:ilvl w:val="0"/>
-          <w:numId w:val="1028"/>
+          <w:numId w:val="1029"/>
         </w:numPr>
       </w:pPr>
       <w:r>
@@ -3407,7 +3447,7 @@
         <w:pStyle w:val="Compact"/>
         <w:numPr>
           <w:ilvl w:val="0"/>
-          <w:numId w:val="1029"/>
+          <w:numId w:val="1030"/>
         </w:numPr>
       </w:pPr>
       <w:r>
@@ -3419,7 +3459,7 @@
         <w:pStyle w:val="Compact"/>
         <w:numPr>
           <w:ilvl w:val="0"/>
-          <w:numId w:val="1029"/>
+          <w:numId w:val="1030"/>
         </w:numPr>
       </w:pPr>
       <w:r>
@@ -3431,7 +3471,7 @@
         <w:pStyle w:val="Compact"/>
         <w:numPr>
           <w:ilvl w:val="0"/>
-          <w:numId w:val="1029"/>
+          <w:numId w:val="1030"/>
         </w:numPr>
       </w:pPr>
       <w:r>
@@ -3443,7 +3483,7 @@
         <w:pStyle w:val="Compact"/>
         <w:numPr>
           <w:ilvl w:val="0"/>
-          <w:numId w:val="1029"/>
+          <w:numId w:val="1030"/>
         </w:numPr>
       </w:pPr>
       <w:r>
@@ -3595,7 +3635,7 @@
         <w:pStyle w:val="Compact"/>
         <w:numPr>
           <w:ilvl w:val="0"/>
-          <w:numId w:val="1030"/>
+          <w:numId w:val="1031"/>
         </w:numPr>
       </w:pPr>
       <w:r>
@@ -3607,7 +3647,7 @@
         <w:pStyle w:val="Compact"/>
         <w:numPr>
           <w:ilvl w:val="0"/>
-          <w:numId w:val="1030"/>
+          <w:numId w:val="1031"/>
         </w:numPr>
       </w:pPr>
       <w:r>
@@ -3619,7 +3659,7 @@
         <w:pStyle w:val="Compact"/>
         <w:numPr>
           <w:ilvl w:val="0"/>
-          <w:numId w:val="1030"/>
+          <w:numId w:val="1031"/>
         </w:numPr>
       </w:pPr>
       <w:r>
@@ -3631,7 +3671,7 @@
         <w:pStyle w:val="Compact"/>
         <w:numPr>
           <w:ilvl w:val="0"/>
-          <w:numId w:val="1030"/>
+          <w:numId w:val="1031"/>
         </w:numPr>
       </w:pPr>
       <w:r>
@@ -3735,7 +3775,7 @@
         <w:pStyle w:val="Compact"/>
         <w:numPr>
           <w:ilvl w:val="0"/>
-          <w:numId w:val="1031"/>
+          <w:numId w:val="1032"/>
         </w:numPr>
       </w:pPr>
       <w:r>
@@ -3747,7 +3787,7 @@
         <w:pStyle w:val="Compact"/>
         <w:numPr>
           <w:ilvl w:val="0"/>
-          <w:numId w:val="1031"/>
+          <w:numId w:val="1032"/>
         </w:numPr>
       </w:pPr>
       <w:r>
@@ -3759,7 +3799,7 @@
         <w:pStyle w:val="Compact"/>
         <w:numPr>
           <w:ilvl w:val="0"/>
-          <w:numId w:val="1031"/>
+          <w:numId w:val="1032"/>
         </w:numPr>
       </w:pPr>
       <w:r>
@@ -3771,7 +3811,7 @@
         <w:pStyle w:val="Compact"/>
         <w:numPr>
           <w:ilvl w:val="0"/>
-          <w:numId w:val="1031"/>
+          <w:numId w:val="1032"/>
         </w:numPr>
       </w:pPr>
       <w:r>
@@ -3852,7 +3892,7 @@
         <w:pStyle w:val="Compact"/>
         <w:numPr>
           <w:ilvl w:val="0"/>
-          <w:numId w:val="1032"/>
+          <w:numId w:val="1033"/>
         </w:numPr>
       </w:pPr>
       <w:r>
@@ -3892,7 +3932,7 @@
         <w:pStyle w:val="Compact"/>
         <w:numPr>
           <w:ilvl w:val="0"/>
-          <w:numId w:val="1033"/>
+          <w:numId w:val="1034"/>
         </w:numPr>
       </w:pPr>
       <w:r>
@@ -3904,7 +3944,7 @@
         <w:pStyle w:val="Compact"/>
         <w:numPr>
           <w:ilvl w:val="0"/>
-          <w:numId w:val="1033"/>
+          <w:numId w:val="1034"/>
         </w:numPr>
       </w:pPr>
       <w:r>
@@ -3916,7 +3956,7 @@
         <w:pStyle w:val="Compact"/>
         <w:numPr>
           <w:ilvl w:val="0"/>
-          <w:numId w:val="1033"/>
+          <w:numId w:val="1034"/>
         </w:numPr>
       </w:pPr>
       <w:r>
@@ -3928,7 +3968,7 @@
         <w:pStyle w:val="Compact"/>
         <w:numPr>
           <w:ilvl w:val="0"/>
-          <w:numId w:val="1033"/>
+          <w:numId w:val="1034"/>
         </w:numPr>
       </w:pPr>
       <w:r>
@@ -4029,7 +4069,7 @@
         <w:pStyle w:val="Compact"/>
         <w:numPr>
           <w:ilvl w:val="0"/>
-          <w:numId w:val="1034"/>
+          <w:numId w:val="1035"/>
         </w:numPr>
       </w:pPr>
       <w:r>
@@ -4041,7 +4081,7 @@
         <w:pStyle w:val="Compact"/>
         <w:numPr>
           <w:ilvl w:val="0"/>
-          <w:numId w:val="1034"/>
+          <w:numId w:val="1035"/>
         </w:numPr>
       </w:pPr>
       <w:r>
@@ -4053,7 +4093,7 @@
         <w:pStyle w:val="Compact"/>
         <w:numPr>
           <w:ilvl w:val="0"/>
-          <w:numId w:val="1034"/>
+          <w:numId w:val="1035"/>
         </w:numPr>
       </w:pPr>
       <w:r>
@@ -4065,7 +4105,7 @@
         <w:pStyle w:val="Compact"/>
         <w:numPr>
           <w:ilvl w:val="0"/>
-          <w:numId w:val="1034"/>
+          <w:numId w:val="1035"/>
         </w:numPr>
       </w:pPr>
       <w:r>
@@ -4166,7 +4206,7 @@
         <w:pStyle w:val="Compact"/>
         <w:numPr>
           <w:ilvl w:val="0"/>
-          <w:numId w:val="1035"/>
+          <w:numId w:val="1036"/>
         </w:numPr>
       </w:pPr>
       <w:r>
@@ -4178,7 +4218,7 @@
         <w:pStyle w:val="Compact"/>
         <w:numPr>
           <w:ilvl w:val="0"/>
-          <w:numId w:val="1035"/>
+          <w:numId w:val="1036"/>
         </w:numPr>
       </w:pPr>
       <w:r>
@@ -4190,7 +4230,7 @@
         <w:pStyle w:val="Compact"/>
         <w:numPr>
           <w:ilvl w:val="0"/>
-          <w:numId w:val="1035"/>
+          <w:numId w:val="1036"/>
         </w:numPr>
       </w:pPr>
       <w:r>
@@ -4202,7 +4242,7 @@
         <w:pStyle w:val="Compact"/>
         <w:numPr>
           <w:ilvl w:val="0"/>
-          <w:numId w:val="1035"/>
+          <w:numId w:val="1036"/>
         </w:numPr>
       </w:pPr>
       <w:r>
@@ -4312,7 +4352,7 @@
         <w:pStyle w:val="Compact"/>
         <w:numPr>
           <w:ilvl w:val="0"/>
-          <w:numId w:val="1036"/>
+          <w:numId w:val="1037"/>
         </w:numPr>
       </w:pPr>
       <w:r>
@@ -4324,7 +4364,7 @@
         <w:pStyle w:val="Compact"/>
         <w:numPr>
           <w:ilvl w:val="0"/>
-          <w:numId w:val="1036"/>
+          <w:numId w:val="1037"/>
         </w:numPr>
       </w:pPr>
       <w:r>
@@ -4336,7 +4376,7 @@
         <w:pStyle w:val="Compact"/>
         <w:numPr>
           <w:ilvl w:val="0"/>
-          <w:numId w:val="1036"/>
+          <w:numId w:val="1037"/>
         </w:numPr>
       </w:pPr>
       <w:r>
@@ -4348,7 +4388,7 @@
         <w:pStyle w:val="Compact"/>
         <w:numPr>
           <w:ilvl w:val="0"/>
-          <w:numId w:val="1036"/>
+          <w:numId w:val="1037"/>
         </w:numPr>
       </w:pPr>
       <w:r>
@@ -4449,7 +4489,7 @@
         <w:pStyle w:val="Compact"/>
         <w:numPr>
           <w:ilvl w:val="0"/>
-          <w:numId w:val="1037"/>
+          <w:numId w:val="1038"/>
         </w:numPr>
       </w:pPr>
       <w:r>
@@ -4461,7 +4501,7 @@
         <w:pStyle w:val="Compact"/>
         <w:numPr>
           <w:ilvl w:val="0"/>
-          <w:numId w:val="1037"/>
+          <w:numId w:val="1038"/>
         </w:numPr>
       </w:pPr>
       <w:r>
@@ -4473,7 +4513,7 @@
         <w:pStyle w:val="Compact"/>
         <w:numPr>
           <w:ilvl w:val="0"/>
-          <w:numId w:val="1037"/>
+          <w:numId w:val="1038"/>
         </w:numPr>
       </w:pPr>
       <w:r>
@@ -4485,7 +4525,7 @@
         <w:pStyle w:val="Compact"/>
         <w:numPr>
           <w:ilvl w:val="0"/>
-          <w:numId w:val="1037"/>
+          <w:numId w:val="1038"/>
         </w:numPr>
       </w:pPr>
       <w:r>
@@ -4586,7 +4626,7 @@
         <w:pStyle w:val="Compact"/>
         <w:numPr>
           <w:ilvl w:val="0"/>
-          <w:numId w:val="1038"/>
+          <w:numId w:val="1039"/>
         </w:numPr>
       </w:pPr>
       <w:r>
@@ -4598,7 +4638,7 @@
         <w:pStyle w:val="Compact"/>
         <w:numPr>
           <w:ilvl w:val="0"/>
-          <w:numId w:val="1038"/>
+          <w:numId w:val="1039"/>
         </w:numPr>
       </w:pPr>
       <w:r>
@@ -4610,7 +4650,7 @@
         <w:pStyle w:val="Compact"/>
         <w:numPr>
           <w:ilvl w:val="0"/>
-          <w:numId w:val="1038"/>
+          <w:numId w:val="1039"/>
         </w:numPr>
       </w:pPr>
       <w:r>
@@ -4622,7 +4662,7 @@
         <w:pStyle w:val="Compact"/>
         <w:numPr>
           <w:ilvl w:val="0"/>
-          <w:numId w:val="1038"/>
+          <w:numId w:val="1039"/>
         </w:numPr>
       </w:pPr>
       <w:r>
@@ -4726,7 +4766,7 @@
         <w:pStyle w:val="Compact"/>
         <w:numPr>
           <w:ilvl w:val="0"/>
-          <w:numId w:val="1039"/>
+          <w:numId w:val="1040"/>
         </w:numPr>
       </w:pPr>
       <w:r>
@@ -4738,7 +4778,7 @@
         <w:pStyle w:val="Compact"/>
         <w:numPr>
           <w:ilvl w:val="0"/>
-          <w:numId w:val="1039"/>
+          <w:numId w:val="1040"/>
         </w:numPr>
       </w:pPr>
       <w:r>
@@ -4750,7 +4790,7 @@
         <w:pStyle w:val="Compact"/>
         <w:numPr>
           <w:ilvl w:val="0"/>
-          <w:numId w:val="1039"/>
+          <w:numId w:val="1040"/>
         </w:numPr>
       </w:pPr>
       <w:r>
@@ -4762,7 +4802,7 @@
         <w:pStyle w:val="Compact"/>
         <w:numPr>
           <w:ilvl w:val="0"/>
-          <w:numId w:val="1039"/>
+          <w:numId w:val="1040"/>
         </w:numPr>
       </w:pPr>
       <w:r>
@@ -4866,7 +4906,7 @@
         <w:pStyle w:val="Compact"/>
         <w:numPr>
           <w:ilvl w:val="0"/>
-          <w:numId w:val="1040"/>
+          <w:numId w:val="1041"/>
         </w:numPr>
       </w:pPr>
       <w:r>
@@ -4878,7 +4918,7 @@
         <w:pStyle w:val="Compact"/>
         <w:numPr>
           <w:ilvl w:val="0"/>
-          <w:numId w:val="1040"/>
+          <w:numId w:val="1041"/>
         </w:numPr>
       </w:pPr>
       <w:r>
@@ -4890,7 +4930,7 @@
         <w:pStyle w:val="Compact"/>
         <w:numPr>
           <w:ilvl w:val="0"/>
-          <w:numId w:val="1040"/>
+          <w:numId w:val="1041"/>
         </w:numPr>
       </w:pPr>
       <w:r>
@@ -4902,7 +4942,7 @@
         <w:pStyle w:val="Compact"/>
         <w:numPr>
           <w:ilvl w:val="0"/>
-          <w:numId w:val="1040"/>
+          <w:numId w:val="1041"/>
         </w:numPr>
       </w:pPr>
       <w:r>
@@ -5003,7 +5043,7 @@
         <w:pStyle w:val="Compact"/>
         <w:numPr>
           <w:ilvl w:val="0"/>
-          <w:numId w:val="1041"/>
+          <w:numId w:val="1042"/>
         </w:numPr>
       </w:pPr>
       <w:r>
@@ -5015,7 +5055,7 @@
         <w:pStyle w:val="Compact"/>
         <w:numPr>
           <w:ilvl w:val="0"/>
-          <w:numId w:val="1041"/>
+          <w:numId w:val="1042"/>
         </w:numPr>
       </w:pPr>
       <w:r>
@@ -5027,7 +5067,7 @@
         <w:pStyle w:val="Compact"/>
         <w:numPr>
           <w:ilvl w:val="0"/>
-          <w:numId w:val="1041"/>
+          <w:numId w:val="1042"/>
         </w:numPr>
       </w:pPr>
       <w:r>
@@ -5039,7 +5079,7 @@
         <w:pStyle w:val="Compact"/>
         <w:numPr>
           <w:ilvl w:val="0"/>
-          <w:numId w:val="1041"/>
+          <w:numId w:val="1042"/>
         </w:numPr>
       </w:pPr>
       <w:r>
@@ -5143,7 +5183,7 @@
         <w:pStyle w:val="Compact"/>
         <w:numPr>
           <w:ilvl w:val="0"/>
-          <w:numId w:val="1042"/>
+          <w:numId w:val="1043"/>
         </w:numPr>
       </w:pPr>
       <w:r>
@@ -5155,7 +5195,7 @@
         <w:pStyle w:val="Compact"/>
         <w:numPr>
           <w:ilvl w:val="0"/>
-          <w:numId w:val="1042"/>
+          <w:numId w:val="1043"/>
         </w:numPr>
       </w:pPr>
       <w:r>
@@ -5167,7 +5207,7 @@
         <w:pStyle w:val="Compact"/>
         <w:numPr>
           <w:ilvl w:val="0"/>
-          <w:numId w:val="1042"/>
+          <w:numId w:val="1043"/>
         </w:numPr>
       </w:pPr>
       <w:r>
@@ -5179,7 +5219,7 @@
         <w:pStyle w:val="Compact"/>
         <w:numPr>
           <w:ilvl w:val="0"/>
-          <w:numId w:val="1042"/>
+          <w:numId w:val="1043"/>
         </w:numPr>
       </w:pPr>
       <w:r>
@@ -5280,7 +5320,7 @@
         <w:pStyle w:val="Compact"/>
         <w:numPr>
           <w:ilvl w:val="0"/>
-          <w:numId w:val="1043"/>
+          <w:numId w:val="1044"/>
         </w:numPr>
       </w:pPr>
       <w:r>
@@ -5292,7 +5332,7 @@
         <w:pStyle w:val="Compact"/>
         <w:numPr>
           <w:ilvl w:val="0"/>
-          <w:numId w:val="1043"/>
+          <w:numId w:val="1044"/>
         </w:numPr>
       </w:pPr>
       <w:r>
@@ -5304,7 +5344,7 @@
         <w:pStyle w:val="Compact"/>
         <w:numPr>
           <w:ilvl w:val="0"/>
-          <w:numId w:val="1043"/>
+          <w:numId w:val="1044"/>
         </w:numPr>
       </w:pPr>
       <w:r>
@@ -5316,7 +5356,7 @@
         <w:pStyle w:val="Compact"/>
         <w:numPr>
           <w:ilvl w:val="0"/>
-          <w:numId w:val="1043"/>
+          <w:numId w:val="1044"/>
         </w:numPr>
       </w:pPr>
       <w:r>
@@ -5420,7 +5460,7 @@
         <w:pStyle w:val="Compact"/>
         <w:numPr>
           <w:ilvl w:val="0"/>
-          <w:numId w:val="1044"/>
+          <w:numId w:val="1045"/>
         </w:numPr>
       </w:pPr>
       <w:r>
@@ -5432,7 +5472,7 @@
         <w:pStyle w:val="Compact"/>
         <w:numPr>
           <w:ilvl w:val="0"/>
-          <w:numId w:val="1044"/>
+          <w:numId w:val="1045"/>
         </w:numPr>
       </w:pPr>
       <w:r>
@@ -5444,7 +5484,7 @@
         <w:pStyle w:val="Compact"/>
         <w:numPr>
           <w:ilvl w:val="0"/>
-          <w:numId w:val="1044"/>
+          <w:numId w:val="1045"/>
         </w:numPr>
       </w:pPr>
       <w:r>
@@ -5456,7 +5496,7 @@
         <w:pStyle w:val="Compact"/>
         <w:numPr>
           <w:ilvl w:val="0"/>
-          <w:numId w:val="1044"/>
+          <w:numId w:val="1045"/>
         </w:numPr>
       </w:pPr>
       <w:r>
@@ -5574,7 +5614,7 @@
         <w:pStyle w:val="Compact"/>
         <w:numPr>
           <w:ilvl w:val="0"/>
-          <w:numId w:val="1045"/>
+          <w:numId w:val="1046"/>
         </w:numPr>
       </w:pPr>
       <w:r>
@@ -5586,7 +5626,7 @@
         <w:pStyle w:val="Compact"/>
         <w:numPr>
           <w:ilvl w:val="0"/>
-          <w:numId w:val="1045"/>
+          <w:numId w:val="1046"/>
         </w:numPr>
       </w:pPr>
       <w:r>
@@ -5598,7 +5638,7 @@
         <w:pStyle w:val="Compact"/>
         <w:numPr>
           <w:ilvl w:val="0"/>
-          <w:numId w:val="1045"/>
+          <w:numId w:val="1046"/>
         </w:numPr>
       </w:pPr>
       <w:r>
@@ -5610,7 +5650,7 @@
         <w:pStyle w:val="Compact"/>
         <w:numPr>
           <w:ilvl w:val="0"/>
-          <w:numId w:val="1045"/>
+          <w:numId w:val="1046"/>
         </w:numPr>
       </w:pPr>
       <w:r>
@@ -5717,7 +5757,7 @@
         <w:pStyle w:val="Compact"/>
         <w:numPr>
           <w:ilvl w:val="0"/>
-          <w:numId w:val="1046"/>
+          <w:numId w:val="1047"/>
         </w:numPr>
       </w:pPr>
       <w:r>
@@ -5771,7 +5811,7 @@
         <w:pStyle w:val="Compact"/>
         <w:numPr>
           <w:ilvl w:val="0"/>
-          <w:numId w:val="1047"/>
+          <w:numId w:val="1048"/>
         </w:numPr>
       </w:pPr>
       <w:r>
@@ -5783,7 +5823,7 @@
         <w:pStyle w:val="Compact"/>
         <w:numPr>
           <w:ilvl w:val="0"/>
-          <w:numId w:val="1047"/>
+          <w:numId w:val="1048"/>
         </w:numPr>
       </w:pPr>
       <w:r>
@@ -5795,7 +5835,7 @@
         <w:pStyle w:val="Compact"/>
         <w:numPr>
           <w:ilvl w:val="0"/>
-          <w:numId w:val="1047"/>
+          <w:numId w:val="1048"/>
         </w:numPr>
       </w:pPr>
       <w:r>
@@ -5807,7 +5847,7 @@
         <w:pStyle w:val="Compact"/>
         <w:numPr>
           <w:ilvl w:val="0"/>
-          <w:numId w:val="1047"/>
+          <w:numId w:val="1048"/>
         </w:numPr>
       </w:pPr>
       <w:r>
@@ -5917,7 +5957,7 @@
         <w:pStyle w:val="Compact"/>
         <w:numPr>
           <w:ilvl w:val="0"/>
-          <w:numId w:val="1048"/>
+          <w:numId w:val="1049"/>
         </w:numPr>
       </w:pPr>
       <w:r>
@@ -5943,7 +5983,7 @@
         <w:pStyle w:val="Compact"/>
         <w:numPr>
           <w:ilvl w:val="0"/>
-          <w:numId w:val="1048"/>
+          <w:numId w:val="1049"/>
         </w:numPr>
       </w:pPr>
       <w:r>
@@ -5965,7 +6005,7 @@
         <w:pStyle w:val="Compact"/>
         <w:numPr>
           <w:ilvl w:val="0"/>
-          <w:numId w:val="1049"/>
+          <w:numId w:val="1050"/>
         </w:numPr>
       </w:pPr>
       <w:r>
@@ -5977,7 +6017,7 @@
         <w:pStyle w:val="Compact"/>
         <w:numPr>
           <w:ilvl w:val="0"/>
-          <w:numId w:val="1049"/>
+          <w:numId w:val="1050"/>
         </w:numPr>
       </w:pPr>
       <w:r>
@@ -5989,7 +6029,7 @@
         <w:pStyle w:val="Compact"/>
         <w:numPr>
           <w:ilvl w:val="0"/>
-          <w:numId w:val="1049"/>
+          <w:numId w:val="1050"/>
         </w:numPr>
       </w:pPr>
       <w:r>
@@ -6001,7 +6041,7 @@
         <w:pStyle w:val="Compact"/>
         <w:numPr>
           <w:ilvl w:val="0"/>
-          <w:numId w:val="1049"/>
+          <w:numId w:val="1050"/>
         </w:numPr>
       </w:pPr>
       <w:r>
@@ -6109,7 +6149,7 @@
         <w:pStyle w:val="Compact"/>
         <w:numPr>
           <w:ilvl w:val="0"/>
-          <w:numId w:val="1050"/>
+          <w:numId w:val="1051"/>
         </w:numPr>
       </w:pPr>
       <w:r>
@@ -6131,7 +6171,7 @@
         <w:pStyle w:val="Compact"/>
         <w:numPr>
           <w:ilvl w:val="0"/>
-          <w:numId w:val="1051"/>
+          <w:numId w:val="1052"/>
         </w:numPr>
       </w:pPr>
       <w:r>
@@ -6143,7 +6183,7 @@
         <w:pStyle w:val="Compact"/>
         <w:numPr>
           <w:ilvl w:val="0"/>
-          <w:numId w:val="1051"/>
+          <w:numId w:val="1052"/>
         </w:numPr>
       </w:pPr>
       <w:r>
@@ -6155,7 +6195,7 @@
         <w:pStyle w:val="Compact"/>
         <w:numPr>
           <w:ilvl w:val="0"/>
-          <w:numId w:val="1051"/>
+          <w:numId w:val="1052"/>
         </w:numPr>
       </w:pPr>
       <w:r>
@@ -6167,7 +6207,7 @@
         <w:pStyle w:val="Compact"/>
         <w:numPr>
           <w:ilvl w:val="0"/>
-          <w:numId w:val="1051"/>
+          <w:numId w:val="1052"/>
         </w:numPr>
       </w:pPr>
       <w:r>
@@ -6248,7 +6288,7 @@
         <w:pStyle w:val="Compact"/>
         <w:numPr>
           <w:ilvl w:val="0"/>
-          <w:numId w:val="1052"/>
+          <w:numId w:val="1053"/>
         </w:numPr>
       </w:pPr>
       <w:r>
@@ -6260,7 +6300,7 @@
         <w:pStyle w:val="Compact"/>
         <w:numPr>
           <w:ilvl w:val="0"/>
-          <w:numId w:val="1052"/>
+          <w:numId w:val="1053"/>
         </w:numPr>
       </w:pPr>
       <w:r>
@@ -6272,7 +6312,7 @@
         <w:pStyle w:val="Compact"/>
         <w:numPr>
           <w:ilvl w:val="0"/>
-          <w:numId w:val="1052"/>
+          <w:numId w:val="1053"/>
         </w:numPr>
       </w:pPr>
       <w:r>
@@ -6292,7 +6332,7 @@
         <w:pStyle w:val="Compact"/>
         <w:numPr>
           <w:ilvl w:val="0"/>
-          <w:numId w:val="1053"/>
+          <w:numId w:val="1054"/>
         </w:numPr>
       </w:pPr>
       <w:r>
@@ -6335,7 +6375,7 @@
         <w:pStyle w:val="Compact"/>
         <w:numPr>
           <w:ilvl w:val="0"/>
-          <w:numId w:val="1054"/>
+          <w:numId w:val="1055"/>
         </w:numPr>
       </w:pPr>
       <w:r>
@@ -6347,7 +6387,7 @@
         <w:pStyle w:val="Compact"/>
         <w:numPr>
           <w:ilvl w:val="0"/>
-          <w:numId w:val="1054"/>
+          <w:numId w:val="1055"/>
         </w:numPr>
       </w:pPr>
       <w:r>
@@ -6359,7 +6399,7 @@
         <w:pStyle w:val="Compact"/>
         <w:numPr>
           <w:ilvl w:val="0"/>
-          <w:numId w:val="1054"/>
+          <w:numId w:val="1055"/>
         </w:numPr>
       </w:pPr>
       <w:r>
@@ -6371,7 +6411,7 @@
         <w:pStyle w:val="Compact"/>
         <w:numPr>
           <w:ilvl w:val="0"/>
-          <w:numId w:val="1054"/>
+          <w:numId w:val="1055"/>
         </w:numPr>
       </w:pPr>
       <w:r>
@@ -6452,7 +6492,7 @@
         <w:pStyle w:val="Compact"/>
         <w:numPr>
           <w:ilvl w:val="0"/>
-          <w:numId w:val="1055"/>
+          <w:numId w:val="1056"/>
         </w:numPr>
       </w:pPr>
       <w:r>
@@ -6464,7 +6504,7 @@
         <w:pStyle w:val="Compact"/>
         <w:numPr>
           <w:ilvl w:val="0"/>
-          <w:numId w:val="1055"/>
+          <w:numId w:val="1056"/>
         </w:numPr>
       </w:pPr>
       <w:r>
@@ -6484,7 +6524,7 @@
         <w:pStyle w:val="Compact"/>
         <w:numPr>
           <w:ilvl w:val="0"/>
-          <w:numId w:val="1056"/>
+          <w:numId w:val="1057"/>
         </w:numPr>
       </w:pPr>
       <w:r>
@@ -6527,7 +6567,7 @@
         <w:pStyle w:val="Compact"/>
         <w:numPr>
           <w:ilvl w:val="0"/>
-          <w:numId w:val="1057"/>
+          <w:numId w:val="1058"/>
         </w:numPr>
       </w:pPr>
       <w:r>
@@ -6539,7 +6579,7 @@
         <w:pStyle w:val="Compact"/>
         <w:numPr>
           <w:ilvl w:val="0"/>
-          <w:numId w:val="1057"/>
+          <w:numId w:val="1058"/>
         </w:numPr>
       </w:pPr>
       <w:r>
@@ -6551,7 +6591,7 @@
         <w:pStyle w:val="Compact"/>
         <w:numPr>
           <w:ilvl w:val="0"/>
-          <w:numId w:val="1057"/>
+          <w:numId w:val="1058"/>
         </w:numPr>
       </w:pPr>
       <w:r>
@@ -6563,7 +6603,7 @@
         <w:pStyle w:val="Compact"/>
         <w:numPr>
           <w:ilvl w:val="0"/>
-          <w:numId w:val="1057"/>
+          <w:numId w:val="1058"/>
         </w:numPr>
       </w:pPr>
       <w:r>
@@ -6644,7 +6684,7 @@
         <w:pStyle w:val="Compact"/>
         <w:numPr>
           <w:ilvl w:val="0"/>
-          <w:numId w:val="1058"/>
+          <w:numId w:val="1059"/>
         </w:numPr>
       </w:pPr>
       <w:r>
@@ -6656,7 +6696,7 @@
         <w:pStyle w:val="Compact"/>
         <w:numPr>
           <w:ilvl w:val="0"/>
-          <w:numId w:val="1058"/>
+          <w:numId w:val="1059"/>
         </w:numPr>
       </w:pPr>
       <w:r>
@@ -6676,7 +6716,7 @@
         <w:pStyle w:val="Compact"/>
         <w:numPr>
           <w:ilvl w:val="0"/>
-          <w:numId w:val="1059"/>
+          <w:numId w:val="1060"/>
         </w:numPr>
       </w:pPr>
       <w:r>
@@ -6719,7 +6759,7 @@
         <w:pStyle w:val="Compact"/>
         <w:numPr>
           <w:ilvl w:val="0"/>
-          <w:numId w:val="1060"/>
+          <w:numId w:val="1061"/>
         </w:numPr>
       </w:pPr>
       <w:r>
@@ -6731,7 +6771,7 @@
         <w:pStyle w:val="Compact"/>
         <w:numPr>
           <w:ilvl w:val="0"/>
-          <w:numId w:val="1060"/>
+          <w:numId w:val="1061"/>
         </w:numPr>
       </w:pPr>
       <w:r>
@@ -6743,7 +6783,7 @@
         <w:pStyle w:val="Compact"/>
         <w:numPr>
           <w:ilvl w:val="0"/>
-          <w:numId w:val="1060"/>
+          <w:numId w:val="1061"/>
         </w:numPr>
       </w:pPr>
       <w:r>
@@ -6755,7 +6795,7 @@
         <w:pStyle w:val="Compact"/>
         <w:numPr>
           <w:ilvl w:val="0"/>
-          <w:numId w:val="1060"/>
+          <w:numId w:val="1061"/>
         </w:numPr>
       </w:pPr>
       <w:r>
@@ -6933,7 +6973,7 @@
         <w:pStyle w:val="Compact"/>
         <w:numPr>
           <w:ilvl w:val="0"/>
-          <w:numId w:val="1061"/>
+          <w:numId w:val="1062"/>
         </w:numPr>
       </w:pPr>
       <w:r>
@@ -7034,7 +7074,7 @@
         <w:pStyle w:val="Compact"/>
         <w:numPr>
           <w:ilvl w:val="0"/>
-          <w:numId w:val="1062"/>
+          <w:numId w:val="1063"/>
         </w:numPr>
       </w:pPr>
       <w:r>
@@ -7056,7 +7096,7 @@
         <w:pStyle w:val="Compact"/>
         <w:numPr>
           <w:ilvl w:val="0"/>
-          <w:numId w:val="1063"/>
+          <w:numId w:val="1064"/>
         </w:numPr>
       </w:pPr>
       <w:r>
@@ -7068,7 +7108,7 @@
         <w:pStyle w:val="Compact"/>
         <w:numPr>
           <w:ilvl w:val="0"/>
-          <w:numId w:val="1063"/>
+          <w:numId w:val="1064"/>
         </w:numPr>
       </w:pPr>
       <w:r>
@@ -7080,7 +7120,7 @@
         <w:pStyle w:val="Compact"/>
         <w:numPr>
           <w:ilvl w:val="0"/>
-          <w:numId w:val="1063"/>
+          <w:numId w:val="1064"/>
         </w:numPr>
       </w:pPr>
       <w:r>
@@ -7092,7 +7132,7 @@
         <w:pStyle w:val="Compact"/>
         <w:numPr>
           <w:ilvl w:val="0"/>
-          <w:numId w:val="1063"/>
+          <w:numId w:val="1064"/>
         </w:numPr>
       </w:pPr>
       <w:r>
@@ -9392,7 +9432,7 @@
         <w:pStyle w:val="Compact"/>
         <w:numPr>
           <w:ilvl w:val="0"/>
-          <w:numId w:val="1064"/>
+          <w:numId w:val="1065"/>
         </w:numPr>
       </w:pPr>
       <w:r>
@@ -9404,7 +9444,7 @@
         <w:pStyle w:val="Compact"/>
         <w:numPr>
           <w:ilvl w:val="0"/>
-          <w:numId w:val="1064"/>
+          <w:numId w:val="1065"/>
         </w:numPr>
       </w:pPr>
       <w:r>
@@ -10431,6 +10471,9 @@
     <w:abstractNumId w:val="991"/>
   </w:num>
   <w:num w:numId="1003">
+    <w:abstractNumId w:val="991"/>
+  </w:num>
+  <w:num w:numId="1004">
     <w:abstractNumId w:val="99411"/>
     <w:lvlOverride w:ilvl="0">
       <w:startOverride w:val="1"/>
@@ -10459,9 +10502,6 @@
     <w:lvlOverride w:ilvl="8">
       <w:startOverride w:val="1"/>
     </w:lvlOverride>
-  </w:num>
-  <w:num w:numId="1004">
-    <w:abstractNumId w:val="991"/>
   </w:num>
   <w:num w:numId="1005">
     <w:abstractNumId w:val="991"/>
@@ -10482,6 +10522,9 @@
     <w:abstractNumId w:val="991"/>
   </w:num>
   <w:num w:numId="1011">
+    <w:abstractNumId w:val="991"/>
+  </w:num>
+  <w:num w:numId="1012">
     <w:abstractNumId w:val="99411"/>
     <w:lvlOverride w:ilvl="0">
       <w:startOverride w:val="1"/>
@@ -10510,14 +10553,14 @@
     <w:lvlOverride w:ilvl="8">
       <w:startOverride w:val="1"/>
     </w:lvlOverride>
-  </w:num>
-  <w:num w:numId="1012">
-    <w:abstractNumId w:val="991"/>
   </w:num>
   <w:num w:numId="1013">
     <w:abstractNumId w:val="991"/>
   </w:num>
   <w:num w:numId="1014">
+    <w:abstractNumId w:val="991"/>
+  </w:num>
+  <w:num w:numId="1015">
     <w:abstractNumId w:val="99411"/>
     <w:lvlOverride w:ilvl="0">
       <w:startOverride w:val="1"/>
@@ -10547,10 +10590,10 @@
       <w:startOverride w:val="1"/>
     </w:lvlOverride>
   </w:num>
-  <w:num w:numId="1015">
+  <w:num w:numId="1016">
     <w:abstractNumId w:val="991"/>
   </w:num>
-  <w:num w:numId="1016">
+  <w:num w:numId="1017">
     <w:abstractNumId w:val="99411"/>
     <w:lvlOverride w:ilvl="0">
       <w:startOverride w:val="1"/>
@@ -10580,10 +10623,10 @@
       <w:startOverride w:val="1"/>
     </w:lvlOverride>
   </w:num>
-  <w:num w:numId="1017">
+  <w:num w:numId="1018">
     <w:abstractNumId w:val="991"/>
   </w:num>
-  <w:num w:numId="1018">
+  <w:num w:numId="1019">
     <w:abstractNumId w:val="99411"/>
     <w:lvlOverride w:ilvl="0">
       <w:startOverride w:val="1"/>
@@ -10613,38 +10656,8 @@
       <w:startOverride w:val="1"/>
     </w:lvlOverride>
   </w:num>
-  <w:num w:numId="1019">
+  <w:num w:numId="1020">
     <w:abstractNumId w:val="991"/>
-  </w:num>
-  <w:num w:numId="1020">
-    <w:abstractNumId w:val="99411"/>
-    <w:lvlOverride w:ilvl="0">
-      <w:startOverride w:val="1"/>
-    </w:lvlOverride>
-    <w:lvlOverride w:ilvl="1">
-      <w:startOverride w:val="1"/>
-    </w:lvlOverride>
-    <w:lvlOverride w:ilvl="2">
-      <w:startOverride w:val="1"/>
-    </w:lvlOverride>
-    <w:lvlOverride w:ilvl="3">
-      <w:startOverride w:val="1"/>
-    </w:lvlOverride>
-    <w:lvlOverride w:ilvl="4">
-      <w:startOverride w:val="1"/>
-    </w:lvlOverride>
-    <w:lvlOverride w:ilvl="5">
-      <w:startOverride w:val="1"/>
-    </w:lvlOverride>
-    <w:lvlOverride w:ilvl="6">
-      <w:startOverride w:val="1"/>
-    </w:lvlOverride>
-    <w:lvlOverride w:ilvl="7">
-      <w:startOverride w:val="1"/>
-    </w:lvlOverride>
-    <w:lvlOverride w:ilvl="8">
-      <w:startOverride w:val="1"/>
-    </w:lvlOverride>
   </w:num>
   <w:num w:numId="1021">
     <w:abstractNumId w:val="99411"/>
@@ -10677,9 +10690,39 @@
     </w:lvlOverride>
   </w:num>
   <w:num w:numId="1022">
+    <w:abstractNumId w:val="99411"/>
+    <w:lvlOverride w:ilvl="0">
+      <w:startOverride w:val="1"/>
+    </w:lvlOverride>
+    <w:lvlOverride w:ilvl="1">
+      <w:startOverride w:val="1"/>
+    </w:lvlOverride>
+    <w:lvlOverride w:ilvl="2">
+      <w:startOverride w:val="1"/>
+    </w:lvlOverride>
+    <w:lvlOverride w:ilvl="3">
+      <w:startOverride w:val="1"/>
+    </w:lvlOverride>
+    <w:lvlOverride w:ilvl="4">
+      <w:startOverride w:val="1"/>
+    </w:lvlOverride>
+    <w:lvlOverride w:ilvl="5">
+      <w:startOverride w:val="1"/>
+    </w:lvlOverride>
+    <w:lvlOverride w:ilvl="6">
+      <w:startOverride w:val="1"/>
+    </w:lvlOverride>
+    <w:lvlOverride w:ilvl="7">
+      <w:startOverride w:val="1"/>
+    </w:lvlOverride>
+    <w:lvlOverride w:ilvl="8">
+      <w:startOverride w:val="1"/>
+    </w:lvlOverride>
+  </w:num>
+  <w:num w:numId="1023">
     <w:abstractNumId w:val="991"/>
   </w:num>
-  <w:num w:numId="1023">
+  <w:num w:numId="1024">
     <w:abstractNumId w:val="99411"/>
     <w:lvlOverride w:ilvl="0">
       <w:startOverride w:val="1"/>
@@ -10708,14 +10751,14 @@
     <w:lvlOverride w:ilvl="8">
       <w:startOverride w:val="1"/>
     </w:lvlOverride>
-  </w:num>
-  <w:num w:numId="1024">
-    <w:abstractNumId w:val="991"/>
   </w:num>
   <w:num w:numId="1025">
     <w:abstractNumId w:val="991"/>
   </w:num>
   <w:num w:numId="1026">
+    <w:abstractNumId w:val="991"/>
+  </w:num>
+  <w:num w:numId="1027">
     <w:abstractNumId w:val="99411"/>
     <w:lvlOverride w:ilvl="0">
       <w:startOverride w:val="1"/>
@@ -10744,9 +10787,6 @@
     <w:lvlOverride w:ilvl="8">
       <w:startOverride w:val="1"/>
     </w:lvlOverride>
-  </w:num>
-  <w:num w:numId="1027">
-    <w:abstractNumId w:val="991"/>
   </w:num>
   <w:num w:numId="1028">
     <w:abstractNumId w:val="991"/>
@@ -10761,6 +10801,9 @@
     <w:abstractNumId w:val="991"/>
   </w:num>
   <w:num w:numId="1032">
+    <w:abstractNumId w:val="991"/>
+  </w:num>
+  <w:num w:numId="1033">
     <w:abstractNumId w:val="99411"/>
     <w:lvlOverride w:ilvl="0">
       <w:startOverride w:val="1"/>
@@ -10789,9 +10832,6 @@
     <w:lvlOverride w:ilvl="8">
       <w:startOverride w:val="1"/>
     </w:lvlOverride>
-  </w:num>
-  <w:num w:numId="1033">
-    <w:abstractNumId w:val="991"/>
   </w:num>
   <w:num w:numId="1034">
     <w:abstractNumId w:val="991"/>
@@ -10830,6 +10870,9 @@
     <w:abstractNumId w:val="991"/>
   </w:num>
   <w:num w:numId="1046">
+    <w:abstractNumId w:val="991"/>
+  </w:num>
+  <w:num w:numId="1047">
     <w:abstractNumId w:val="99411"/>
     <w:lvlOverride w:ilvl="0">
       <w:startOverride w:val="1"/>
@@ -10859,10 +10902,10 @@
       <w:startOverride w:val="1"/>
     </w:lvlOverride>
   </w:num>
-  <w:num w:numId="1047">
+  <w:num w:numId="1048">
     <w:abstractNumId w:val="991"/>
   </w:num>
-  <w:num w:numId="1048">
+  <w:num w:numId="1049">
     <w:abstractNumId w:val="99411"/>
     <w:lvlOverride w:ilvl="0">
       <w:startOverride w:val="1"/>
@@ -10892,10 +10935,10 @@
       <w:startOverride w:val="1"/>
     </w:lvlOverride>
   </w:num>
-  <w:num w:numId="1049">
+  <w:num w:numId="1050">
     <w:abstractNumId w:val="991"/>
   </w:num>
-  <w:num w:numId="1050">
+  <w:num w:numId="1051">
     <w:abstractNumId w:val="99411"/>
     <w:lvlOverride w:ilvl="0">
       <w:startOverride w:val="1"/>
@@ -10924,14 +10967,14 @@
     <w:lvlOverride w:ilvl="8">
       <w:startOverride w:val="1"/>
     </w:lvlOverride>
-  </w:num>
-  <w:num w:numId="1051">
-    <w:abstractNumId w:val="991"/>
   </w:num>
   <w:num w:numId="1052">
     <w:abstractNumId w:val="991"/>
   </w:num>
   <w:num w:numId="1053">
+    <w:abstractNumId w:val="991"/>
+  </w:num>
+  <w:num w:numId="1054">
     <w:abstractNumId w:val="99411"/>
     <w:lvlOverride w:ilvl="0">
       <w:startOverride w:val="1"/>
@@ -10960,14 +11003,14 @@
     <w:lvlOverride w:ilvl="8">
       <w:startOverride w:val="1"/>
     </w:lvlOverride>
-  </w:num>
-  <w:num w:numId="1054">
-    <w:abstractNumId w:val="991"/>
   </w:num>
   <w:num w:numId="1055">
     <w:abstractNumId w:val="991"/>
   </w:num>
   <w:num w:numId="1056">
+    <w:abstractNumId w:val="991"/>
+  </w:num>
+  <w:num w:numId="1057">
     <w:abstractNumId w:val="99411"/>
     <w:lvlOverride w:ilvl="0">
       <w:startOverride w:val="1"/>
@@ -10996,14 +11039,14 @@
     <w:lvlOverride w:ilvl="8">
       <w:startOverride w:val="1"/>
     </w:lvlOverride>
-  </w:num>
-  <w:num w:numId="1057">
-    <w:abstractNumId w:val="991"/>
   </w:num>
   <w:num w:numId="1058">
     <w:abstractNumId w:val="991"/>
   </w:num>
   <w:num w:numId="1059">
+    <w:abstractNumId w:val="991"/>
+  </w:num>
+  <w:num w:numId="1060">
     <w:abstractNumId w:val="99411"/>
     <w:lvlOverride w:ilvl="0">
       <w:startOverride w:val="1"/>
@@ -11033,38 +11076,8 @@
       <w:startOverride w:val="1"/>
     </w:lvlOverride>
   </w:num>
-  <w:num w:numId="1060">
+  <w:num w:numId="1061">
     <w:abstractNumId w:val="991"/>
-  </w:num>
-  <w:num w:numId="1061">
-    <w:abstractNumId w:val="99411"/>
-    <w:lvlOverride w:ilvl="0">
-      <w:startOverride w:val="1"/>
-    </w:lvlOverride>
-    <w:lvlOverride w:ilvl="1">
-      <w:startOverride w:val="1"/>
-    </w:lvlOverride>
-    <w:lvlOverride w:ilvl="2">
-      <w:startOverride w:val="1"/>
-    </w:lvlOverride>
-    <w:lvlOverride w:ilvl="3">
-      <w:startOverride w:val="1"/>
-    </w:lvlOverride>
-    <w:lvlOverride w:ilvl="4">
-      <w:startOverride w:val="1"/>
-    </w:lvlOverride>
-    <w:lvlOverride w:ilvl="5">
-      <w:startOverride w:val="1"/>
-    </w:lvlOverride>
-    <w:lvlOverride w:ilvl="6">
-      <w:startOverride w:val="1"/>
-    </w:lvlOverride>
-    <w:lvlOverride w:ilvl="7">
-      <w:startOverride w:val="1"/>
-    </w:lvlOverride>
-    <w:lvlOverride w:ilvl="8">
-      <w:startOverride w:val="1"/>
-    </w:lvlOverride>
   </w:num>
   <w:num w:numId="1062">
     <w:abstractNumId w:val="99411"/>
@@ -11097,9 +11110,39 @@
     </w:lvlOverride>
   </w:num>
   <w:num w:numId="1063">
+    <w:abstractNumId w:val="99411"/>
+    <w:lvlOverride w:ilvl="0">
+      <w:startOverride w:val="1"/>
+    </w:lvlOverride>
+    <w:lvlOverride w:ilvl="1">
+      <w:startOverride w:val="1"/>
+    </w:lvlOverride>
+    <w:lvlOverride w:ilvl="2">
+      <w:startOverride w:val="1"/>
+    </w:lvlOverride>
+    <w:lvlOverride w:ilvl="3">
+      <w:startOverride w:val="1"/>
+    </w:lvlOverride>
+    <w:lvlOverride w:ilvl="4">
+      <w:startOverride w:val="1"/>
+    </w:lvlOverride>
+    <w:lvlOverride w:ilvl="5">
+      <w:startOverride w:val="1"/>
+    </w:lvlOverride>
+    <w:lvlOverride w:ilvl="6">
+      <w:startOverride w:val="1"/>
+    </w:lvlOverride>
+    <w:lvlOverride w:ilvl="7">
+      <w:startOverride w:val="1"/>
+    </w:lvlOverride>
+    <w:lvlOverride w:ilvl="8">
+      <w:startOverride w:val="1"/>
+    </w:lvlOverride>
+  </w:num>
+  <w:num w:numId="1064">
     <w:abstractNumId w:val="991"/>
   </w:num>
-  <w:num w:numId="1064">
+  <w:num w:numId="1065">
     <w:abstractNumId w:val="991"/>
   </w:num>
 </w:numbering>

</xml_diff>